<commit_message>
update: sync revised letter copy and xian dates
</commit_message>
<xml_diff>
--- a/assets/letter/letter.docx
+++ b/assets/letter/letter.docx
@@ -220,7 +220,17 @@
         <w:suppressLineNumbers w:val="0"/>
       </w:pPr>
       <w:r>
-        <w:t>工作、吃饭、回家，第二天继续上班。</w:t>
+        <w:t>工作、吃饭、回</w:t>
+      </w:r>
+      <w:r>
+        <w:rPr>
+          <w:rFonts w:hint="eastAsia"/>
+          <w:lang w:val="en-US" w:eastAsia="zh-CN"/>
+        </w:rPr>
+        <w:t>民宿</w:t>
+      </w:r>
+      <w:r>
+        <w:t>，第二天继续上班。</w:t>
       </w:r>
     </w:p>
     <w:p>
@@ -247,7 +257,21 @@
         <w:rPr>
           <w:rStyle w:val="7"/>
         </w:rPr>
-        <w:t>2024年10月21日，我们正式在一起。</w:t>
+        <w:t>2024年10月21日，我们</w:t>
+      </w:r>
+      <w:r>
+        <w:rPr>
+          <w:rStyle w:val="7"/>
+          <w:rFonts w:hint="eastAsia"/>
+          <w:lang w:val="en-US" w:eastAsia="zh-CN"/>
+        </w:rPr>
+        <w:t>第一次见面随后确定关系</w:t>
+      </w:r>
+      <w:r>
+        <w:rPr>
+          <w:rStyle w:val="7"/>
+        </w:rPr>
+        <w:t>。</w:t>
       </w:r>
     </w:p>
     <w:p>
@@ -319,7 +343,14 @@
         <w:suppressLineNumbers w:val="0"/>
       </w:pPr>
       <w:r>
-        <w:t>你就在房子里等着我回来。</w:t>
+        <w:rPr>
+          <w:rFonts w:hint="eastAsia"/>
+          <w:lang w:val="en-US" w:eastAsia="zh-CN"/>
+        </w:rPr>
+        <w:t>下班你到单位接我或者我打车回去</w:t>
+      </w:r>
+      <w:r>
+        <w:t>。</w:t>
       </w:r>
     </w:p>
     <w:p>
@@ -412,67 +443,117 @@
         <w:suppressLineNumbers w:val="0"/>
       </w:pPr>
       <w:r>
-        <w:t>03｜2025 · 西安</w:t>
-      </w:r>
-    </w:p>
-    <w:p>
-      <w:pPr>
-        <w:pStyle w:val="4"/>
-        <w:keepNext w:val="0"/>
-        <w:keepLines w:val="0"/>
-        <w:widowControl/>
-        <w:suppressLineNumbers w:val="0"/>
-      </w:pPr>
-      <w:r>
-        <w:t>2025年1月，你又陪我一起去了西安。</w:t>
-      </w:r>
-    </w:p>
-    <w:p>
-      <w:pPr>
-        <w:pStyle w:val="4"/>
-        <w:keepNext w:val="0"/>
-        <w:keepLines w:val="0"/>
-        <w:widowControl/>
-        <w:suppressLineNumbers w:val="0"/>
-      </w:pPr>
-      <w:r>
-        <w:t>我们一起吃东西，一起出去玩，一起在一个陌生的城市里到处走。</w:t>
-      </w:r>
-    </w:p>
-    <w:p>
-      <w:pPr>
-        <w:pStyle w:val="4"/>
-        <w:keepNext w:val="0"/>
-        <w:keepLines w:val="0"/>
-        <w:widowControl/>
-        <w:suppressLineNumbers w:val="0"/>
-      </w:pPr>
-      <w:r>
-        <w:t>那些日子没有什么惊天动地的大事。</w:t>
-      </w:r>
-    </w:p>
-    <w:p>
-      <w:pPr>
-        <w:pStyle w:val="4"/>
-        <w:keepNext w:val="0"/>
-        <w:keepLines w:val="0"/>
-        <w:widowControl/>
-        <w:suppressLineNumbers w:val="0"/>
-      </w:pPr>
-      <w:r>
-        <w:t>可现在回头看，我记得最清楚的反而不是去了哪个景点。</w:t>
-      </w:r>
-    </w:p>
-    <w:p>
-      <w:pPr>
-        <w:pStyle w:val="4"/>
-        <w:keepNext w:val="0"/>
-        <w:keepLines w:val="0"/>
-        <w:widowControl/>
-        <w:suppressLineNumbers w:val="0"/>
-      </w:pPr>
-      <w:r>
-        <w:t>而是那时候的感觉。</w:t>
+        <w:t>03｜202</w:t>
+      </w:r>
+      <w:r>
+        <w:rPr>
+          <w:rFonts w:hint="eastAsia"/>
+          <w:lang w:val="en-US" w:eastAsia="zh-CN"/>
+        </w:rPr>
+        <w:t>4</w:t>
+      </w:r>
+      <w:r>
+        <w:t xml:space="preserve"> · 西安</w:t>
+      </w:r>
+    </w:p>
+    <w:p>
+      <w:pPr>
+        <w:pStyle w:val="4"/>
+        <w:keepNext w:val="0"/>
+        <w:keepLines w:val="0"/>
+        <w:widowControl/>
+        <w:suppressLineNumbers w:val="0"/>
+      </w:pPr>
+      <w:r>
+        <w:t>202</w:t>
+      </w:r>
+      <w:r>
+        <w:rPr>
+          <w:rFonts w:hint="eastAsia"/>
+          <w:lang w:val="en-US" w:eastAsia="zh-CN"/>
+        </w:rPr>
+        <w:t>4</w:t>
+      </w:r>
+      <w:r>
+        <w:t>年1</w:t>
+      </w:r>
+      <w:r>
+        <w:rPr>
+          <w:rFonts w:hint="eastAsia"/>
+          <w:lang w:val="en-US" w:eastAsia="zh-CN"/>
+        </w:rPr>
+        <w:t>1</w:t>
+      </w:r>
+      <w:r>
+        <w:t>月</w:t>
+      </w:r>
+      <w:r>
+        <w:rPr>
+          <w:rFonts w:hint="eastAsia"/>
+          <w:lang w:val="en-US" w:eastAsia="zh-CN"/>
+        </w:rPr>
+        <w:t>底</w:t>
+      </w:r>
+      <w:r>
+        <w:t>，你又陪我一起去了西安</w:t>
+      </w:r>
+      <w:r>
+        <w:rPr>
+          <w:rFonts w:hint="eastAsia"/>
+          <w:lang w:eastAsia="zh-CN"/>
+        </w:rPr>
+        <w:t>，</w:t>
+      </w:r>
+      <w:r>
+        <w:rPr>
+          <w:rFonts w:hint="eastAsia"/>
+          <w:lang w:val="en-US" w:eastAsia="zh-CN"/>
+        </w:rPr>
+        <w:t>这是我从来没想到的事情</w:t>
+      </w:r>
+      <w:r>
+        <w:t>。</w:t>
+      </w:r>
+    </w:p>
+    <w:p>
+      <w:pPr>
+        <w:pStyle w:val="4"/>
+        <w:keepNext w:val="0"/>
+        <w:keepLines w:val="0"/>
+        <w:widowControl/>
+        <w:suppressLineNumbers w:val="0"/>
+      </w:pPr>
+      <w:r>
+        <w:t>我们一起吃东西，一起出去玩，一起在一个城市里到处走。</w:t>
+      </w:r>
+    </w:p>
+    <w:p>
+      <w:pPr>
+        <w:pStyle w:val="4"/>
+        <w:keepNext w:val="0"/>
+        <w:keepLines w:val="0"/>
+        <w:widowControl/>
+        <w:suppressLineNumbers w:val="0"/>
+      </w:pPr>
+      <w:r>
+        <w:t>那些日子没有什么惊天动地的大事</w:t>
+      </w:r>
+      <w:r>
+        <w:rPr>
+          <w:rFonts w:hint="eastAsia"/>
+          <w:lang w:eastAsia="zh-CN"/>
+        </w:rPr>
+        <w:t>，</w:t>
+      </w:r>
+      <w:r>
+        <w:rPr>
+          <w:rFonts w:hint="eastAsia"/>
+          <w:lang w:val="en-US" w:eastAsia="zh-CN"/>
+        </w:rPr>
+        <w:t>但每天的日子都很开心、快乐、充实</w:t>
+      </w:r>
+      <w:r>
+        <w:t>。</w:t>
       </w:r>
     </w:p>
     <w:p>
@@ -499,7 +580,7 @@
         <w:suppressLineNumbers w:val="0"/>
       </w:pPr>
       <w:r>
-        <w:t>后来很多具体的小事情，也许会随着时间慢慢忘掉。</w:t>
+        <w:t>很多具体的小事情，也许会随着时间慢慢忘掉。</w:t>
       </w:r>
     </w:p>
     <w:p>
@@ -556,7 +637,17 @@
         <w:suppressLineNumbers w:val="0"/>
       </w:pPr>
       <w:r>
-        <w:t>后来我们离开国内。</w:t>
+        <w:t>后来我们</w:t>
+      </w:r>
+      <w:r>
+        <w:rPr>
+          <w:rFonts w:hint="eastAsia"/>
+          <w:lang w:val="en-US" w:eastAsia="zh-CN"/>
+        </w:rPr>
+        <w:t>先后</w:t>
+      </w:r>
+      <w:r>
+        <w:t>离开国内。</w:t>
       </w:r>
     </w:p>
     <w:p>
@@ -1285,7 +1376,17 @@
         <w:suppressLineNumbers w:val="0"/>
       </w:pPr>
       <w:r>
-        <w:t>07｜38岁的你，25岁的我</w:t>
+        <w:t>07｜38岁的你，2</w:t>
+      </w:r>
+      <w:r>
+        <w:rPr>
+          <w:rFonts w:hint="eastAsia"/>
+          <w:lang w:val="en-US" w:eastAsia="zh-CN"/>
+        </w:rPr>
+        <w:t>6</w:t>
+      </w:r>
+      <w:r>
+        <w:t>岁的我</w:t>
       </w:r>
     </w:p>
     <w:p>
@@ -1309,19 +1410,39 @@
         <w:suppressLineNumbers w:val="0"/>
       </w:pPr>
       <w:r>
-        <w:t>我25岁。</w:t>
-      </w:r>
-    </w:p>
-    <w:p>
-      <w:pPr>
-        <w:pStyle w:val="4"/>
-        <w:keepNext w:val="0"/>
-        <w:keepLines w:val="0"/>
-        <w:widowControl/>
-        <w:suppressLineNumbers w:val="0"/>
-      </w:pPr>
-      <w:r>
-        <w:t>这13岁的年龄差，我知道有时候会让你没有安全感。</w:t>
+        <w:t>我2</w:t>
+      </w:r>
+      <w:r>
+        <w:rPr>
+          <w:rFonts w:hint="eastAsia"/>
+          <w:lang w:val="en-US" w:eastAsia="zh-CN"/>
+        </w:rPr>
+        <w:t>6</w:t>
+      </w:r>
+      <w:r>
+        <w:t>岁。</w:t>
+      </w:r>
+    </w:p>
+    <w:p>
+      <w:pPr>
+        <w:pStyle w:val="4"/>
+        <w:keepNext w:val="0"/>
+        <w:keepLines w:val="0"/>
+        <w:widowControl/>
+        <w:suppressLineNumbers w:val="0"/>
+      </w:pPr>
+      <w:r>
+        <w:t>这1</w:t>
+      </w:r>
+      <w:r>
+        <w:rPr>
+          <w:rFonts w:hint="eastAsia"/>
+          <w:lang w:val="en-US" w:eastAsia="zh-CN"/>
+        </w:rPr>
+        <w:t>2</w:t>
+      </w:r>
+      <w:r>
+        <w:t>岁的年龄差，我知道有时候会让你没有安全感。</w:t>
       </w:r>
     </w:p>
     <w:p>
@@ -2638,19 +2759,24 @@
         <w:suppressLineNumbers w:val="0"/>
       </w:pPr>
       <w:r>
-        <w:t>从2024年的海口。</w:t>
-      </w:r>
-    </w:p>
-    <w:p>
-      <w:pPr>
-        <w:pStyle w:val="4"/>
-        <w:keepNext w:val="0"/>
-        <w:keepLines w:val="0"/>
-        <w:widowControl/>
-        <w:suppressLineNumbers w:val="0"/>
-      </w:pPr>
-      <w:r>
-        <w:t>到2025年的西安。</w:t>
+        <w:t>从2024年的海口</w:t>
+      </w:r>
+      <w:r>
+        <w:rPr>
+          <w:rFonts w:hint="eastAsia"/>
+          <w:lang w:eastAsia="zh-CN"/>
+        </w:rPr>
+        <w:t>、</w:t>
+      </w:r>
+      <w:r>
+        <w:rPr>
+          <w:rFonts w:hint="eastAsia"/>
+          <w:lang w:val="en-US" w:eastAsia="zh-CN"/>
+        </w:rPr>
+        <w:t>西安</w:t>
+      </w:r>
+      <w:r>
+        <w:t>。</w:t>
       </w:r>
     </w:p>
     <w:p>
@@ -3007,7 +3133,17 @@
         <w:suppressLineNumbers w:val="0"/>
       </w:pPr>
       <w:r>
-        <w:t>谢谢2025年陪我去西安的你。</w:t>
+        <w:t>谢谢202</w:t>
+      </w:r>
+      <w:r>
+        <w:rPr>
+          <w:rFonts w:hint="eastAsia"/>
+          <w:lang w:val="en-US" w:eastAsia="zh-CN"/>
+        </w:rPr>
+        <w:t>4</w:t>
+      </w:r>
+      <w:r>
+        <w:t>年陪我去西安的你。</w:t>
       </w:r>
     </w:p>
     <w:p>
@@ -3220,18 +3356,6 @@
         <w:suppressLineNumbers w:val="0"/>
       </w:pPr>
       <w:r>
-        <w:t>为了几百块钱发愁。</w:t>
-      </w:r>
-    </w:p>
-    <w:p>
-      <w:pPr>
-        <w:pStyle w:val="4"/>
-        <w:keepNext w:val="0"/>
-        <w:keepLines w:val="0"/>
-        <w:widowControl/>
-        <w:suppressLineNumbers w:val="0"/>
-      </w:pPr>
-      <w:r>
         <w:t>为了一句话生气。</w:t>
       </w:r>
     </w:p>
@@ -3268,7 +3392,19 @@
         <w:suppressLineNumbers w:val="0"/>
       </w:pPr>
       <w:r>
-        <w:t>当年那个25岁的我，没有只是在这里说漂亮话。</w:t>
+        <w:t>当年那个2</w:t>
+      </w:r>
+      <w:r>
+        <w:rPr>
+          <w:rFonts w:hint="eastAsia"/>
+          <w:lang w:val="en-US" w:eastAsia="zh-CN"/>
+        </w:rPr>
+        <w:t>6</w:t>
+      </w:r>
+      <w:bookmarkStart w:id="0" w:name="_GoBack"/>
+      <w:bookmarkEnd w:id="0"/>
+      <w:r>
+        <w:t>岁的我，没有只是在这里说漂亮话。</w:t>
       </w:r>
     </w:p>
     <w:p>
@@ -3489,8 +3625,6 @@
         </w:rPr>
         <w:t>当年在海口遇见你，真好。</w:t>
       </w:r>
-      <w:bookmarkStart w:id="0" w:name="_GoBack"/>
-      <w:bookmarkEnd w:id="0"/>
     </w:p>
     <w:p>
       <w:pPr>
@@ -3657,7 +3791,7 @@
     <w:lsdException w:unhideWhenUsed="0" w:uiPriority="0" w:semiHidden="0" w:name="Document Map"/>
     <w:lsdException w:unhideWhenUsed="0" w:uiPriority="0" w:semiHidden="0" w:name="Plain Text"/>
     <w:lsdException w:unhideWhenUsed="0" w:uiPriority="0" w:semiHidden="0" w:name="E-mail Signature"/>
-    <w:lsdException w:unhideWhenUsed="0" w:uiPriority="0" w:semiHidden="0" w:name="Normal (Web)"/>
+    <w:lsdException w:qFormat="1" w:unhideWhenUsed="0" w:uiPriority="0" w:semiHidden="0" w:name="Normal (Web)"/>
     <w:lsdException w:unhideWhenUsed="0" w:uiPriority="0" w:semiHidden="0" w:name="HTML Acronym"/>
     <w:lsdException w:unhideWhenUsed="0" w:uiPriority="0" w:semiHidden="0" w:name="HTML Address"/>
     <w:lsdException w:unhideWhenUsed="0" w:uiPriority="0" w:semiHidden="0" w:name="HTML Cite"/>
@@ -3668,7 +3802,7 @@
     <w:lsdException w:unhideWhenUsed="0" w:uiPriority="0" w:semiHidden="0" w:name="HTML Sample"/>
     <w:lsdException w:unhideWhenUsed="0" w:uiPriority="0" w:semiHidden="0" w:name="HTML Typewriter"/>
     <w:lsdException w:unhideWhenUsed="0" w:uiPriority="0" w:semiHidden="0" w:name="HTML Variable"/>
-    <w:lsdException w:unhideWhenUsed="0" w:uiPriority="0" w:name="Normal Table"/>
+    <w:lsdException w:qFormat="1" w:unhideWhenUsed="0" w:uiPriority="0" w:name="Normal Table"/>
     <w:lsdException w:unhideWhenUsed="0" w:uiPriority="0" w:semiHidden="0" w:name="annotation subject"/>
     <w:lsdException w:unhideWhenUsed="0" w:uiPriority="0" w:semiHidden="0" w:name="Table Simple 1"/>
     <w:lsdException w:unhideWhenUsed="0" w:uiPriority="0" w:semiHidden="0" w:name="Table Simple 2"/>
@@ -3881,6 +4015,7 @@
   <w:style w:type="table" w:default="1" w:styleId="5">
     <w:name w:val="Normal Table"/>
     <w:semiHidden/>
+    <w:qFormat/>
     <w:uiPriority w:val="0"/>
     <w:tblPr>
       <w:tblCellMar>
@@ -3894,6 +4029,7 @@
   <w:style w:type="paragraph" w:styleId="4">
     <w:name w:val="Normal (Web)"/>
     <w:basedOn w:val="1"/>
+    <w:qFormat/>
     <w:uiPriority w:val="0"/>
     <w:pPr>
       <w:spacing w:before="0" w:beforeAutospacing="1" w:after="0" w:afterAutospacing="1"/>

</xml_diff>